<commit_message>
Complete Gary Lau's consent form with verified name and title
Dr Gary Kui-Kai Lau, Assistant Dean (Education Innovations), Clinical
Associate Professor, Division of Neurology, HKUMED; identity confirmed
via ORCID 0000-0002-8657-2418 and the HKU staff page.

Co-Authored-By: Claude Fable 5 <noreply@anthropic.com>
Claude-Session: https://claude.ai/code/session_01KoT3i8geZspYBMMKVYJUTG
</commit_message>
<xml_diff>
--- a/docs/thesis/expert_panel/Consent_Form_Gary.docx
+++ b/docs/thesis/expert_panel/Consent_Form_Gary.docx
@@ -228,7 +228,7 @@
                 <w:rFonts w:ascii="Arial" w:hAnsi="Arial"/>
                 <w:sz w:val="17"/>
               </w:rPr>
-              <w:t>Dr Gary [FULL NAME TO BE COMPLETED]</w:t>
+              <w:t>Dr Gary Kui-Kai Lau</w:t>
             </w:r>
           </w:p>
         </w:tc>
@@ -332,7 +332,7 @@
                 <w:rFonts w:ascii="Arial" w:hAnsi="Arial"/>
                 <w:sz w:val="17"/>
               </w:rPr>
-              <w:t>Associate Dean, LKS Faculty of Medicine, The University of Hong Kong (HKUMED) [title to be confirmed verbatim]</w:t>
+              <w:t>Assistant Dean (Education Innovations) and Clinical Associate Professor, Division of Neurology, Department of Medicine, LKS Faculty of Medicine, The University of Hong Kong (ORCID 0000-0002-8657-2418)</w:t>
             </w:r>
           </w:p>
         </w:tc>
@@ -736,7 +736,7 @@
                 <w:rFonts w:ascii="Arial" w:hAnsi="Arial"/>
                 <w:sz w:val="18"/>
               </w:rPr>
-              <w:t>Dr Gary [FULL NAME TO BE COMPLETED]</w:t>
+              <w:t>Dr Gary Kui-Kai Lau</w:t>
             </w:r>
           </w:p>
         </w:tc>
@@ -1627,7 +1627,7 @@
                 <w:rFonts w:ascii="Arial" w:hAnsi="Arial"/>
                 <w:sz w:val="18"/>
               </w:rPr>
-              <w:t>Dr Gary [FULL NAME TO BE COMPLETED]</w:t>
+              <w:t>Dr Gary Kui-Kai Lau</w:t>
             </w:r>
           </w:p>
         </w:tc>

</xml_diff>